<commit_message>
feat: enhance OS detection and refine router handling
- Added new Android and router OS vendors to the OS detection logic.
- Enhanced router type detection to include FortiOS, SonicOS, PAN-OS, and Sophos Firewall OS.
- Updated tests to cover new router vendor cases.
- Introduced security headers check in API health endpoint tests.
- Added ErrorBoundary component to handle UI errors gracefully.
- Implemented API token support for authenticated requests, including local storage management.
- Added CSV and JSON export functionality for scan results, ensuring safe handling of sensitive data.
- Created unit tests for new authentication and export functionalities.
</commit_message>
<xml_diff>
--- a/docs/ENUMGRID_Security_Audit_Report.docx
+++ b/docs/ENUMGRID_Security_Audit_Report.docx
@@ -398,7 +398,74 @@
                 <w:sz w:val="19"/>
                 <w:szCs w:val="19"/>
               </w:rPr>
-              <w:t xml:space="preserve">[insert date]</w:t>
+              <w:t xml:space="preserve">30 June 2026</w:t>
+            </w:r>
+          </w:p>
+        </w:tc>
+      </w:tr>
+      <w:tr>
+        <w:tc>
+          <w:tcPr>
+            <w:tcW w:type="dxa" w:w="2100"/>
+            <w:tcBorders>
+              <w:top w:val="single" w:color="CCCCCC" w:sz="1"/>
+              <w:left w:val="single" w:color="CCCCCC" w:sz="1"/>
+              <w:bottom w:val="single" w:color="CCCCCC" w:sz="1"/>
+              <w:right w:val="single" w:color="CCCCCC" w:sz="1"/>
+            </w:tcBorders>
+            <w:shd w:fill="F1F5F9" w:val="clear"/>
+            <w:tcMar>
+              <w:top w:type="dxa" w:w="60"/>
+              <w:left w:type="dxa" w:w="110"/>
+              <w:bottom w:type="dxa" w:w="60"/>
+              <w:right w:type="dxa" w:w="110"/>
+            </w:tcMar>
+            <w:vAlign w:val="center"/>
+          </w:tcPr>
+          <w:p>
+            <w:pPr>
+              <w:jc w:val="left"/>
+            </w:pPr>
+            <w:r>
+              <w:rPr>
+                <w:b/>
+                <w:bCs/>
+                <w:sz w:val="19"/>
+                <w:szCs w:val="19"/>
+              </w:rPr>
+              <w:t xml:space="preserve">Assessor</w:t>
+            </w:r>
+          </w:p>
+        </w:tc>
+        <w:tc>
+          <w:tcPr>
+            <w:tcW w:type="dxa" w:w="7260"/>
+            <w:tcBorders>
+              <w:top w:val="single" w:color="CCCCCC" w:sz="1"/>
+              <w:left w:val="single" w:color="CCCCCC" w:sz="1"/>
+              <w:bottom w:val="single" w:color="CCCCCC" w:sz="1"/>
+              <w:right w:val="single" w:color="CCCCCC" w:sz="1"/>
+            </w:tcBorders>
+            <w:tcMar>
+              <w:top w:type="dxa" w:w="60"/>
+              <w:left w:type="dxa" w:w="110"/>
+              <w:bottom w:type="dxa" w:w="60"/>
+              <w:right w:type="dxa" w:w="110"/>
+            </w:tcMar>
+            <w:vAlign w:val="center"/>
+          </w:tcPr>
+          <w:p>
+            <w:pPr>
+              <w:jc w:val="left"/>
+            </w:pPr>
+            <w:r>
+              <w:rPr>
+                <w:b w:val="false"/>
+                <w:bCs w:val="false"/>
+                <w:sz w:val="19"/>
+                <w:szCs w:val="19"/>
+              </w:rPr>
+              <w:t xml:space="preserve">Author-conducted (self-assessment) — see §2.1</w:t>
             </w:r>
           </w:p>
         </w:tc>
@@ -528,6 +595,935 @@
       </w:pPr>
       <w:r>
         <w:t xml:space="preserve">Regression assurance: every code fix was accompanied by an automated test, and the full suite re-run.</w:t>
+      </w:r>
+    </w:p>
+    <w:p>
+      <w:pPr>
+        <w:pStyle w:val="Heading2"/>
+      </w:pPr>
+      <w:r>
+        <w:t xml:space="preserve">2.1  Tooling and Limitations</w:t>
+      </w:r>
+    </w:p>
+    <w:p>
+      <w:pPr>
+        <w:spacing w:after="120"/>
+      </w:pPr>
+      <w:r>
+        <w:t xml:space="preserve">The following tools were used. Versions are recorded for reproducibility.</w:t>
+      </w:r>
+    </w:p>
+    <w:tbl>
+      <w:tblPr>
+        <w:tblW w:type="dxa" w:w="9360"/>
+        <w:tblBorders>
+          <w:top w:val="single" w:color="auto" w:sz="4"/>
+          <w:left w:val="single" w:color="auto" w:sz="4"/>
+          <w:bottom w:val="single" w:color="auto" w:sz="4"/>
+          <w:right w:val="single" w:color="auto" w:sz="4"/>
+          <w:insideH w:val="single" w:color="auto" w:sz="4"/>
+          <w:insideV w:val="single" w:color="auto" w:sz="4"/>
+        </w:tblBorders>
+      </w:tblPr>
+      <w:tblGrid>
+        <w:gridCol w:w="2700"/>
+        <w:gridCol w:w="1500"/>
+        <w:gridCol w:w="5160"/>
+      </w:tblGrid>
+      <w:tr>
+        <w:trPr>
+          <w:tblHeader/>
+        </w:trPr>
+        <w:tc>
+          <w:tcPr>
+            <w:tcW w:type="dxa" w:w="2700"/>
+            <w:tcBorders>
+              <w:top w:val="single" w:color="CCCCCC" w:sz="1"/>
+              <w:left w:val="single" w:color="CCCCCC" w:sz="1"/>
+              <w:bottom w:val="single" w:color="CCCCCC" w:sz="1"/>
+              <w:right w:val="single" w:color="CCCCCC" w:sz="1"/>
+            </w:tcBorders>
+            <w:shd w:fill="1F3A5F" w:val="clear"/>
+            <w:tcMar>
+              <w:top w:type="dxa" w:w="60"/>
+              <w:left w:type="dxa" w:w="110"/>
+              <w:bottom w:type="dxa" w:w="60"/>
+              <w:right w:type="dxa" w:w="110"/>
+            </w:tcMar>
+            <w:vAlign w:val="center"/>
+          </w:tcPr>
+          <w:p>
+            <w:pPr>
+              <w:jc w:val="left"/>
+            </w:pPr>
+            <w:r>
+              <w:rPr>
+                <w:b/>
+                <w:bCs/>
+                <w:color w:val="FFFFFF"/>
+                <w:sz w:val="19"/>
+                <w:szCs w:val="19"/>
+              </w:rPr>
+              <w:t xml:space="preserve">Tool</w:t>
+            </w:r>
+          </w:p>
+        </w:tc>
+        <w:tc>
+          <w:tcPr>
+            <w:tcW w:type="dxa" w:w="1500"/>
+            <w:tcBorders>
+              <w:top w:val="single" w:color="CCCCCC" w:sz="1"/>
+              <w:left w:val="single" w:color="CCCCCC" w:sz="1"/>
+              <w:bottom w:val="single" w:color="CCCCCC" w:sz="1"/>
+              <w:right w:val="single" w:color="CCCCCC" w:sz="1"/>
+            </w:tcBorders>
+            <w:shd w:fill="1F3A5F" w:val="clear"/>
+            <w:tcMar>
+              <w:top w:type="dxa" w:w="60"/>
+              <w:left w:type="dxa" w:w="110"/>
+              <w:bottom w:type="dxa" w:w="60"/>
+              <w:right w:type="dxa" w:w="110"/>
+            </w:tcMar>
+            <w:vAlign w:val="center"/>
+          </w:tcPr>
+          <w:p>
+            <w:pPr>
+              <w:jc w:val="left"/>
+            </w:pPr>
+            <w:r>
+              <w:rPr>
+                <w:b/>
+                <w:bCs/>
+                <w:color w:val="FFFFFF"/>
+                <w:sz w:val="19"/>
+                <w:szCs w:val="19"/>
+              </w:rPr>
+              <w:t xml:space="preserve">Version</w:t>
+            </w:r>
+          </w:p>
+        </w:tc>
+        <w:tc>
+          <w:tcPr>
+            <w:tcW w:type="dxa" w:w="5160"/>
+            <w:tcBorders>
+              <w:top w:val="single" w:color="CCCCCC" w:sz="1"/>
+              <w:left w:val="single" w:color="CCCCCC" w:sz="1"/>
+              <w:bottom w:val="single" w:color="CCCCCC" w:sz="1"/>
+              <w:right w:val="single" w:color="CCCCCC" w:sz="1"/>
+            </w:tcBorders>
+            <w:shd w:fill="1F3A5F" w:val="clear"/>
+            <w:tcMar>
+              <w:top w:type="dxa" w:w="60"/>
+              <w:left w:type="dxa" w:w="110"/>
+              <w:bottom w:type="dxa" w:w="60"/>
+              <w:right w:type="dxa" w:w="110"/>
+            </w:tcMar>
+            <w:vAlign w:val="center"/>
+          </w:tcPr>
+          <w:p>
+            <w:pPr>
+              <w:jc w:val="left"/>
+            </w:pPr>
+            <w:r>
+              <w:rPr>
+                <w:b/>
+                <w:bCs/>
+                <w:color w:val="FFFFFF"/>
+                <w:sz w:val="19"/>
+                <w:szCs w:val="19"/>
+              </w:rPr>
+              <w:t xml:space="preserve">Purpose</w:t>
+            </w:r>
+          </w:p>
+        </w:tc>
+      </w:tr>
+      <w:tr>
+        <w:tc>
+          <w:tcPr>
+            <w:tcW w:type="dxa" w:w="2700"/>
+            <w:tcBorders>
+              <w:top w:val="single" w:color="CCCCCC" w:sz="1"/>
+              <w:left w:val="single" w:color="CCCCCC" w:sz="1"/>
+              <w:bottom w:val="single" w:color="CCCCCC" w:sz="1"/>
+              <w:right w:val="single" w:color="CCCCCC" w:sz="1"/>
+            </w:tcBorders>
+            <w:tcMar>
+              <w:top w:type="dxa" w:w="60"/>
+              <w:left w:type="dxa" w:w="110"/>
+              <w:bottom w:type="dxa" w:w="60"/>
+              <w:right w:type="dxa" w:w="110"/>
+            </w:tcMar>
+            <w:vAlign w:val="center"/>
+          </w:tcPr>
+          <w:p>
+            <w:pPr>
+              <w:jc w:val="left"/>
+            </w:pPr>
+            <w:r>
+              <w:rPr>
+                <w:b/>
+                <w:bCs/>
+                <w:sz w:val="19"/>
+                <w:szCs w:val="19"/>
+              </w:rPr>
+              <w:t xml:space="preserve">Manual code review</w:t>
+            </w:r>
+          </w:p>
+        </w:tc>
+        <w:tc>
+          <w:tcPr>
+            <w:tcW w:type="dxa" w:w="1500"/>
+            <w:tcBorders>
+              <w:top w:val="single" w:color="CCCCCC" w:sz="1"/>
+              <w:left w:val="single" w:color="CCCCCC" w:sz="1"/>
+              <w:bottom w:val="single" w:color="CCCCCC" w:sz="1"/>
+              <w:right w:val="single" w:color="CCCCCC" w:sz="1"/>
+            </w:tcBorders>
+            <w:tcMar>
+              <w:top w:type="dxa" w:w="60"/>
+              <w:left w:type="dxa" w:w="110"/>
+              <w:bottom w:type="dxa" w:w="60"/>
+              <w:right w:type="dxa" w:w="110"/>
+            </w:tcMar>
+            <w:vAlign w:val="center"/>
+          </w:tcPr>
+          <w:p>
+            <w:pPr>
+              <w:jc w:val="left"/>
+            </w:pPr>
+            <w:r>
+              <w:rPr>
+                <w:b w:val="false"/>
+                <w:bCs w:val="false"/>
+                <w:sz w:val="19"/>
+                <w:szCs w:val="19"/>
+              </w:rPr>
+              <w:t xml:space="preserve">—</w:t>
+            </w:r>
+          </w:p>
+        </w:tc>
+        <w:tc>
+          <w:tcPr>
+            <w:tcW w:type="dxa" w:w="5160"/>
+            <w:tcBorders>
+              <w:top w:val="single" w:color="CCCCCC" w:sz="1"/>
+              <w:left w:val="single" w:color="CCCCCC" w:sz="1"/>
+              <w:bottom w:val="single" w:color="CCCCCC" w:sz="1"/>
+              <w:right w:val="single" w:color="CCCCCC" w:sz="1"/>
+            </w:tcBorders>
+            <w:tcMar>
+              <w:top w:type="dxa" w:w="60"/>
+              <w:left w:type="dxa" w:w="110"/>
+              <w:bottom w:type="dxa" w:w="60"/>
+              <w:right w:type="dxa" w:w="110"/>
+            </w:tcMar>
+            <w:vAlign w:val="center"/>
+          </w:tcPr>
+          <w:p>
+            <w:pPr>
+              <w:jc w:val="left"/>
+            </w:pPr>
+            <w:r>
+              <w:rPr>
+                <w:b w:val="false"/>
+                <w:bCs w:val="false"/>
+                <w:sz w:val="19"/>
+                <w:szCs w:val="19"/>
+              </w:rPr>
+              <w:t xml:space="preserve">OWASP-aligned source review by vulnerability class (CWE-mapped)</w:t>
+            </w:r>
+          </w:p>
+        </w:tc>
+      </w:tr>
+      <w:tr>
+        <w:tc>
+          <w:tcPr>
+            <w:tcW w:type="dxa" w:w="2700"/>
+            <w:tcBorders>
+              <w:top w:val="single" w:color="CCCCCC" w:sz="1"/>
+              <w:left w:val="single" w:color="CCCCCC" w:sz="1"/>
+              <w:bottom w:val="single" w:color="CCCCCC" w:sz="1"/>
+              <w:right w:val="single" w:color="CCCCCC" w:sz="1"/>
+            </w:tcBorders>
+            <w:shd w:fill="F1F5F9" w:val="clear"/>
+            <w:tcMar>
+              <w:top w:type="dxa" w:w="60"/>
+              <w:left w:type="dxa" w:w="110"/>
+              <w:bottom w:type="dxa" w:w="60"/>
+              <w:right w:type="dxa" w:w="110"/>
+            </w:tcMar>
+            <w:vAlign w:val="center"/>
+          </w:tcPr>
+          <w:p>
+            <w:pPr>
+              <w:jc w:val="left"/>
+            </w:pPr>
+            <w:r>
+              <w:rPr>
+                <w:b/>
+                <w:bCs/>
+                <w:sz w:val="19"/>
+                <w:szCs w:val="19"/>
+              </w:rPr>
+              <w:t xml:space="preserve">Bandit</w:t>
+            </w:r>
+          </w:p>
+        </w:tc>
+        <w:tc>
+          <w:tcPr>
+            <w:tcW w:type="dxa" w:w="1500"/>
+            <w:tcBorders>
+              <w:top w:val="single" w:color="CCCCCC" w:sz="1"/>
+              <w:left w:val="single" w:color="CCCCCC" w:sz="1"/>
+              <w:bottom w:val="single" w:color="CCCCCC" w:sz="1"/>
+              <w:right w:val="single" w:color="CCCCCC" w:sz="1"/>
+            </w:tcBorders>
+            <w:shd w:fill="F1F5F9" w:val="clear"/>
+            <w:tcMar>
+              <w:top w:type="dxa" w:w="60"/>
+              <w:left w:type="dxa" w:w="110"/>
+              <w:bottom w:type="dxa" w:w="60"/>
+              <w:right w:type="dxa" w:w="110"/>
+            </w:tcMar>
+            <w:vAlign w:val="center"/>
+          </w:tcPr>
+          <w:p>
+            <w:pPr>
+              <w:jc w:val="left"/>
+            </w:pPr>
+            <w:r>
+              <w:rPr>
+                <w:b w:val="false"/>
+                <w:bCs w:val="false"/>
+                <w:sz w:val="19"/>
+                <w:szCs w:val="19"/>
+              </w:rPr>
+              <w:t xml:space="preserve">1.9.4</w:t>
+            </w:r>
+          </w:p>
+        </w:tc>
+        <w:tc>
+          <w:tcPr>
+            <w:tcW w:type="dxa" w:w="5160"/>
+            <w:tcBorders>
+              <w:top w:val="single" w:color="CCCCCC" w:sz="1"/>
+              <w:left w:val="single" w:color="CCCCCC" w:sz="1"/>
+              <w:bottom w:val="single" w:color="CCCCCC" w:sz="1"/>
+              <w:right w:val="single" w:color="CCCCCC" w:sz="1"/>
+            </w:tcBorders>
+            <w:shd w:fill="F1F5F9" w:val="clear"/>
+            <w:tcMar>
+              <w:top w:type="dxa" w:w="60"/>
+              <w:left w:type="dxa" w:w="110"/>
+              <w:bottom w:type="dxa" w:w="60"/>
+              <w:right w:type="dxa" w:w="110"/>
+            </w:tcMar>
+            <w:vAlign w:val="center"/>
+          </w:tcPr>
+          <w:p>
+            <w:pPr>
+              <w:jc w:val="left"/>
+            </w:pPr>
+            <w:r>
+              <w:rPr>
+                <w:b w:val="false"/>
+                <w:bCs w:val="false"/>
+                <w:sz w:val="19"/>
+                <w:szCs w:val="19"/>
+              </w:rPr>
+              <w:t xml:space="preserve">Python static application security testing (SAST), run at full strength</w:t>
+            </w:r>
+          </w:p>
+        </w:tc>
+      </w:tr>
+      <w:tr>
+        <w:tc>
+          <w:tcPr>
+            <w:tcW w:type="dxa" w:w="2700"/>
+            <w:tcBorders>
+              <w:top w:val="single" w:color="CCCCCC" w:sz="1"/>
+              <w:left w:val="single" w:color="CCCCCC" w:sz="1"/>
+              <w:bottom w:val="single" w:color="CCCCCC" w:sz="1"/>
+              <w:right w:val="single" w:color="CCCCCC" w:sz="1"/>
+            </w:tcBorders>
+            <w:tcMar>
+              <w:top w:type="dxa" w:w="60"/>
+              <w:left w:type="dxa" w:w="110"/>
+              <w:bottom w:type="dxa" w:w="60"/>
+              <w:right w:type="dxa" w:w="110"/>
+            </w:tcMar>
+            <w:vAlign w:val="center"/>
+          </w:tcPr>
+          <w:p>
+            <w:pPr>
+              <w:jc w:val="left"/>
+            </w:pPr>
+            <w:r>
+              <w:rPr>
+                <w:b/>
+                <w:bCs/>
+                <w:sz w:val="19"/>
+                <w:szCs w:val="19"/>
+              </w:rPr>
+              <w:t xml:space="preserve">pip-audit</w:t>
+            </w:r>
+          </w:p>
+        </w:tc>
+        <w:tc>
+          <w:tcPr>
+            <w:tcW w:type="dxa" w:w="1500"/>
+            <w:tcBorders>
+              <w:top w:val="single" w:color="CCCCCC" w:sz="1"/>
+              <w:left w:val="single" w:color="CCCCCC" w:sz="1"/>
+              <w:bottom w:val="single" w:color="CCCCCC" w:sz="1"/>
+              <w:right w:val="single" w:color="CCCCCC" w:sz="1"/>
+            </w:tcBorders>
+            <w:tcMar>
+              <w:top w:type="dxa" w:w="60"/>
+              <w:left w:type="dxa" w:w="110"/>
+              <w:bottom w:type="dxa" w:w="60"/>
+              <w:right w:type="dxa" w:w="110"/>
+            </w:tcMar>
+            <w:vAlign w:val="center"/>
+          </w:tcPr>
+          <w:p>
+            <w:pPr>
+              <w:jc w:val="left"/>
+            </w:pPr>
+            <w:r>
+              <w:rPr>
+                <w:b w:val="false"/>
+                <w:bCs w:val="false"/>
+                <w:sz w:val="19"/>
+                <w:szCs w:val="19"/>
+              </w:rPr>
+              <w:t xml:space="preserve">2.10.0</w:t>
+            </w:r>
+          </w:p>
+        </w:tc>
+        <w:tc>
+          <w:tcPr>
+            <w:tcW w:type="dxa" w:w="5160"/>
+            <w:tcBorders>
+              <w:top w:val="single" w:color="CCCCCC" w:sz="1"/>
+              <w:left w:val="single" w:color="CCCCCC" w:sz="1"/>
+              <w:bottom w:val="single" w:color="CCCCCC" w:sz="1"/>
+              <w:right w:val="single" w:color="CCCCCC" w:sz="1"/>
+            </w:tcBorders>
+            <w:tcMar>
+              <w:top w:type="dxa" w:w="60"/>
+              <w:left w:type="dxa" w:w="110"/>
+              <w:bottom w:type="dxa" w:w="60"/>
+              <w:right w:type="dxa" w:w="110"/>
+            </w:tcMar>
+            <w:vAlign w:val="center"/>
+          </w:tcPr>
+          <w:p>
+            <w:pPr>
+              <w:jc w:val="left"/>
+            </w:pPr>
+            <w:r>
+              <w:rPr>
+                <w:b w:val="false"/>
+                <w:bCs w:val="false"/>
+                <w:sz w:val="19"/>
+                <w:szCs w:val="19"/>
+              </w:rPr>
+              <w:t xml:space="preserve">Python dependency vulnerability scan (SCA)</w:t>
+            </w:r>
+          </w:p>
+        </w:tc>
+      </w:tr>
+      <w:tr>
+        <w:tc>
+          <w:tcPr>
+            <w:tcW w:type="dxa" w:w="2700"/>
+            <w:tcBorders>
+              <w:top w:val="single" w:color="CCCCCC" w:sz="1"/>
+              <w:left w:val="single" w:color="CCCCCC" w:sz="1"/>
+              <w:bottom w:val="single" w:color="CCCCCC" w:sz="1"/>
+              <w:right w:val="single" w:color="CCCCCC" w:sz="1"/>
+            </w:tcBorders>
+            <w:shd w:fill="F1F5F9" w:val="clear"/>
+            <w:tcMar>
+              <w:top w:type="dxa" w:w="60"/>
+              <w:left w:type="dxa" w:w="110"/>
+              <w:bottom w:type="dxa" w:w="60"/>
+              <w:right w:type="dxa" w:w="110"/>
+            </w:tcMar>
+            <w:vAlign w:val="center"/>
+          </w:tcPr>
+          <w:p>
+            <w:pPr>
+              <w:jc w:val="left"/>
+            </w:pPr>
+            <w:r>
+              <w:rPr>
+                <w:b/>
+                <w:bCs/>
+                <w:sz w:val="19"/>
+                <w:szCs w:val="19"/>
+              </w:rPr>
+              <w:t xml:space="preserve">npm audit</w:t>
+            </w:r>
+          </w:p>
+        </w:tc>
+        <w:tc>
+          <w:tcPr>
+            <w:tcW w:type="dxa" w:w="1500"/>
+            <w:tcBorders>
+              <w:top w:val="single" w:color="CCCCCC" w:sz="1"/>
+              <w:left w:val="single" w:color="CCCCCC" w:sz="1"/>
+              <w:bottom w:val="single" w:color="CCCCCC" w:sz="1"/>
+              <w:right w:val="single" w:color="CCCCCC" w:sz="1"/>
+            </w:tcBorders>
+            <w:shd w:fill="F1F5F9" w:val="clear"/>
+            <w:tcMar>
+              <w:top w:type="dxa" w:w="60"/>
+              <w:left w:type="dxa" w:w="110"/>
+              <w:bottom w:type="dxa" w:w="60"/>
+              <w:right w:type="dxa" w:w="110"/>
+            </w:tcMar>
+            <w:vAlign w:val="center"/>
+          </w:tcPr>
+          <w:p>
+            <w:pPr>
+              <w:jc w:val="left"/>
+            </w:pPr>
+            <w:r>
+              <w:rPr>
+                <w:b w:val="false"/>
+                <w:bCs w:val="false"/>
+                <w:sz w:val="19"/>
+                <w:szCs w:val="19"/>
+              </w:rPr>
+              <w:t xml:space="preserve">npm 11.12.1</w:t>
+            </w:r>
+          </w:p>
+        </w:tc>
+        <w:tc>
+          <w:tcPr>
+            <w:tcW w:type="dxa" w:w="5160"/>
+            <w:tcBorders>
+              <w:top w:val="single" w:color="CCCCCC" w:sz="1"/>
+              <w:left w:val="single" w:color="CCCCCC" w:sz="1"/>
+              <w:bottom w:val="single" w:color="CCCCCC" w:sz="1"/>
+              <w:right w:val="single" w:color="CCCCCC" w:sz="1"/>
+            </w:tcBorders>
+            <w:shd w:fill="F1F5F9" w:val="clear"/>
+            <w:tcMar>
+              <w:top w:type="dxa" w:w="60"/>
+              <w:left w:type="dxa" w:w="110"/>
+              <w:bottom w:type="dxa" w:w="60"/>
+              <w:right w:type="dxa" w:w="110"/>
+            </w:tcMar>
+            <w:vAlign w:val="center"/>
+          </w:tcPr>
+          <w:p>
+            <w:pPr>
+              <w:jc w:val="left"/>
+            </w:pPr>
+            <w:r>
+              <w:rPr>
+                <w:b w:val="false"/>
+                <w:bCs w:val="false"/>
+                <w:sz w:val="19"/>
+                <w:szCs w:val="19"/>
+              </w:rPr>
+              <w:t xml:space="preserve">Node dependency vulnerability scan (SCA), shipped deps</w:t>
+            </w:r>
+          </w:p>
+        </w:tc>
+      </w:tr>
+      <w:tr>
+        <w:tc>
+          <w:tcPr>
+            <w:tcW w:type="dxa" w:w="2700"/>
+            <w:tcBorders>
+              <w:top w:val="single" w:color="CCCCCC" w:sz="1"/>
+              <w:left w:val="single" w:color="CCCCCC" w:sz="1"/>
+              <w:bottom w:val="single" w:color="CCCCCC" w:sz="1"/>
+              <w:right w:val="single" w:color="CCCCCC" w:sz="1"/>
+            </w:tcBorders>
+            <w:tcMar>
+              <w:top w:type="dxa" w:w="60"/>
+              <w:left w:type="dxa" w:w="110"/>
+              <w:bottom w:type="dxa" w:w="60"/>
+              <w:right w:type="dxa" w:w="110"/>
+            </w:tcMar>
+            <w:vAlign w:val="center"/>
+          </w:tcPr>
+          <w:p>
+            <w:pPr>
+              <w:jc w:val="left"/>
+            </w:pPr>
+            <w:r>
+              <w:rPr>
+                <w:b/>
+                <w:bCs/>
+                <w:sz w:val="19"/>
+                <w:szCs w:val="19"/>
+              </w:rPr>
+              <w:t xml:space="preserve">Ruff</w:t>
+            </w:r>
+          </w:p>
+        </w:tc>
+        <w:tc>
+          <w:tcPr>
+            <w:tcW w:type="dxa" w:w="1500"/>
+            <w:tcBorders>
+              <w:top w:val="single" w:color="CCCCCC" w:sz="1"/>
+              <w:left w:val="single" w:color="CCCCCC" w:sz="1"/>
+              <w:bottom w:val="single" w:color="CCCCCC" w:sz="1"/>
+              <w:right w:val="single" w:color="CCCCCC" w:sz="1"/>
+            </w:tcBorders>
+            <w:tcMar>
+              <w:top w:type="dxa" w:w="60"/>
+              <w:left w:type="dxa" w:w="110"/>
+              <w:bottom w:type="dxa" w:w="60"/>
+              <w:right w:type="dxa" w:w="110"/>
+            </w:tcMar>
+            <w:vAlign w:val="center"/>
+          </w:tcPr>
+          <w:p>
+            <w:pPr>
+              <w:jc w:val="left"/>
+            </w:pPr>
+            <w:r>
+              <w:rPr>
+                <w:b w:val="false"/>
+                <w:bCs w:val="false"/>
+                <w:sz w:val="19"/>
+                <w:szCs w:val="19"/>
+              </w:rPr>
+              <w:t xml:space="preserve">0.15.16</w:t>
+            </w:r>
+          </w:p>
+        </w:tc>
+        <w:tc>
+          <w:tcPr>
+            <w:tcW w:type="dxa" w:w="5160"/>
+            <w:tcBorders>
+              <w:top w:val="single" w:color="CCCCCC" w:sz="1"/>
+              <w:left w:val="single" w:color="CCCCCC" w:sz="1"/>
+              <w:bottom w:val="single" w:color="CCCCCC" w:sz="1"/>
+              <w:right w:val="single" w:color="CCCCCC" w:sz="1"/>
+            </w:tcBorders>
+            <w:tcMar>
+              <w:top w:type="dxa" w:w="60"/>
+              <w:left w:type="dxa" w:w="110"/>
+              <w:bottom w:type="dxa" w:w="60"/>
+              <w:right w:type="dxa" w:w="110"/>
+            </w:tcMar>
+            <w:vAlign w:val="center"/>
+          </w:tcPr>
+          <w:p>
+            <w:pPr>
+              <w:jc w:val="left"/>
+            </w:pPr>
+            <w:r>
+              <w:rPr>
+                <w:b w:val="false"/>
+                <w:bCs w:val="false"/>
+                <w:sz w:val="19"/>
+                <w:szCs w:val="19"/>
+              </w:rPr>
+              <w:t xml:space="preserve">Static lint / code-quality checks</w:t>
+            </w:r>
+          </w:p>
+        </w:tc>
+      </w:tr>
+      <w:tr>
+        <w:tc>
+          <w:tcPr>
+            <w:tcW w:type="dxa" w:w="2700"/>
+            <w:tcBorders>
+              <w:top w:val="single" w:color="CCCCCC" w:sz="1"/>
+              <w:left w:val="single" w:color="CCCCCC" w:sz="1"/>
+              <w:bottom w:val="single" w:color="CCCCCC" w:sz="1"/>
+              <w:right w:val="single" w:color="CCCCCC" w:sz="1"/>
+            </w:tcBorders>
+            <w:shd w:fill="F1F5F9" w:val="clear"/>
+            <w:tcMar>
+              <w:top w:type="dxa" w:w="60"/>
+              <w:left w:type="dxa" w:w="110"/>
+              <w:bottom w:type="dxa" w:w="60"/>
+              <w:right w:type="dxa" w:w="110"/>
+            </w:tcMar>
+            <w:vAlign w:val="center"/>
+          </w:tcPr>
+          <w:p>
+            <w:pPr>
+              <w:jc w:val="left"/>
+            </w:pPr>
+            <w:r>
+              <w:rPr>
+                <w:b/>
+                <w:bCs/>
+                <w:sz w:val="19"/>
+                <w:szCs w:val="19"/>
+              </w:rPr>
+              <w:t xml:space="preserve">pytest + hypothesis</w:t>
+            </w:r>
+          </w:p>
+        </w:tc>
+        <w:tc>
+          <w:tcPr>
+            <w:tcW w:type="dxa" w:w="1500"/>
+            <w:tcBorders>
+              <w:top w:val="single" w:color="CCCCCC" w:sz="1"/>
+              <w:left w:val="single" w:color="CCCCCC" w:sz="1"/>
+              <w:bottom w:val="single" w:color="CCCCCC" w:sz="1"/>
+              <w:right w:val="single" w:color="CCCCCC" w:sz="1"/>
+            </w:tcBorders>
+            <w:shd w:fill="F1F5F9" w:val="clear"/>
+            <w:tcMar>
+              <w:top w:type="dxa" w:w="60"/>
+              <w:left w:type="dxa" w:w="110"/>
+              <w:bottom w:type="dxa" w:w="60"/>
+              <w:right w:type="dxa" w:w="110"/>
+            </w:tcMar>
+            <w:vAlign w:val="center"/>
+          </w:tcPr>
+          <w:p>
+            <w:pPr>
+              <w:jc w:val="left"/>
+            </w:pPr>
+            <w:r>
+              <w:rPr>
+                <w:b w:val="false"/>
+                <w:bCs w:val="false"/>
+                <w:sz w:val="19"/>
+                <w:szCs w:val="19"/>
+              </w:rPr>
+              <w:t xml:space="preserve">—</w:t>
+            </w:r>
+          </w:p>
+        </w:tc>
+        <w:tc>
+          <w:tcPr>
+            <w:tcW w:type="dxa" w:w="5160"/>
+            <w:tcBorders>
+              <w:top w:val="single" w:color="CCCCCC" w:sz="1"/>
+              <w:left w:val="single" w:color="CCCCCC" w:sz="1"/>
+              <w:bottom w:val="single" w:color="CCCCCC" w:sz="1"/>
+              <w:right w:val="single" w:color="CCCCCC" w:sz="1"/>
+            </w:tcBorders>
+            <w:shd w:fill="F1F5F9" w:val="clear"/>
+            <w:tcMar>
+              <w:top w:type="dxa" w:w="60"/>
+              <w:left w:type="dxa" w:w="110"/>
+              <w:bottom w:type="dxa" w:w="60"/>
+              <w:right w:type="dxa" w:w="110"/>
+            </w:tcMar>
+            <w:vAlign w:val="center"/>
+          </w:tcPr>
+          <w:p>
+            <w:pPr>
+              <w:jc w:val="left"/>
+            </w:pPr>
+            <w:r>
+              <w:rPr>
+                <w:b w:val="false"/>
+                <w:bCs w:val="false"/>
+                <w:sz w:val="19"/>
+                <w:szCs w:val="19"/>
+              </w:rPr>
+              <w:t xml:space="preserve">Regression and property-based fuzz tests (446 total)</w:t>
+            </w:r>
+          </w:p>
+        </w:tc>
+      </w:tr>
+      <w:tr>
+        <w:tc>
+          <w:tcPr>
+            <w:tcW w:type="dxa" w:w="2700"/>
+            <w:tcBorders>
+              <w:top w:val="single" w:color="CCCCCC" w:sz="1"/>
+              <w:left w:val="single" w:color="CCCCCC" w:sz="1"/>
+              <w:bottom w:val="single" w:color="CCCCCC" w:sz="1"/>
+              <w:right w:val="single" w:color="CCCCCC" w:sz="1"/>
+            </w:tcBorders>
+            <w:tcMar>
+              <w:top w:type="dxa" w:w="60"/>
+              <w:left w:type="dxa" w:w="110"/>
+              <w:bottom w:type="dxa" w:w="60"/>
+              <w:right w:type="dxa" w:w="110"/>
+            </w:tcMar>
+            <w:vAlign w:val="center"/>
+          </w:tcPr>
+          <w:p>
+            <w:pPr>
+              <w:jc w:val="left"/>
+            </w:pPr>
+            <w:r>
+              <w:rPr>
+                <w:b/>
+                <w:bCs/>
+                <w:sz w:val="19"/>
+                <w:szCs w:val="19"/>
+              </w:rPr>
+              <w:t xml:space="preserve">Runtime</w:t>
+            </w:r>
+          </w:p>
+        </w:tc>
+        <w:tc>
+          <w:tcPr>
+            <w:tcW w:type="dxa" w:w="1500"/>
+            <w:tcBorders>
+              <w:top w:val="single" w:color="CCCCCC" w:sz="1"/>
+              <w:left w:val="single" w:color="CCCCCC" w:sz="1"/>
+              <w:bottom w:val="single" w:color="CCCCCC" w:sz="1"/>
+              <w:right w:val="single" w:color="CCCCCC" w:sz="1"/>
+            </w:tcBorders>
+            <w:tcMar>
+              <w:top w:type="dxa" w:w="60"/>
+              <w:left w:type="dxa" w:w="110"/>
+              <w:bottom w:type="dxa" w:w="60"/>
+              <w:right w:type="dxa" w:w="110"/>
+            </w:tcMar>
+            <w:vAlign w:val="center"/>
+          </w:tcPr>
+          <w:p>
+            <w:pPr>
+              <w:jc w:val="left"/>
+            </w:pPr>
+            <w:r>
+              <w:rPr>
+                <w:b w:val="false"/>
+                <w:bCs w:val="false"/>
+                <w:sz w:val="19"/>
+                <w:szCs w:val="19"/>
+              </w:rPr>
+              <w:t xml:space="preserve">Python 3.14.5</w:t>
+            </w:r>
+          </w:p>
+        </w:tc>
+        <w:tc>
+          <w:tcPr>
+            <w:tcW w:type="dxa" w:w="5160"/>
+            <w:tcBorders>
+              <w:top w:val="single" w:color="CCCCCC" w:sz="1"/>
+              <w:left w:val="single" w:color="CCCCCC" w:sz="1"/>
+              <w:bottom w:val="single" w:color="CCCCCC" w:sz="1"/>
+              <w:right w:val="single" w:color="CCCCCC" w:sz="1"/>
+            </w:tcBorders>
+            <w:tcMar>
+              <w:top w:type="dxa" w:w="60"/>
+              <w:left w:type="dxa" w:w="110"/>
+              <w:bottom w:type="dxa" w:w="60"/>
+              <w:right w:type="dxa" w:w="110"/>
+            </w:tcMar>
+            <w:vAlign w:val="center"/>
+          </w:tcPr>
+          <w:p>
+            <w:pPr>
+              <w:jc w:val="left"/>
+            </w:pPr>
+            <w:r>
+              <w:rPr>
+                <w:b w:val="false"/>
+                <w:bCs w:val="false"/>
+                <w:sz w:val="19"/>
+                <w:szCs w:val="19"/>
+              </w:rPr>
+              <w:t xml:space="preserve">Interpreter under which the assessment was run</w:t>
+            </w:r>
+          </w:p>
+        </w:tc>
+      </w:tr>
+    </w:tbl>
+    <w:p>
+      <w:pPr>
+        <w:spacing w:after="100"/>
+      </w:pPr>
+    </w:p>
+    <w:p>
+      <w:pPr>
+        <w:spacing w:after="120"/>
+      </w:pPr>
+      <w:r>
+        <w:t xml:space="preserve">Limitations. The following bound the assurance this assessment provides:</w:t>
+      </w:r>
+    </w:p>
+    <w:p>
+      <w:pPr>
+        <w:pStyle w:val="ListParagraph"/>
+        <w:numPr>
+          <w:ilvl w:val="0"/>
+          <w:numId w:val="2"/>
+        </w:numPr>
+        <w:spacing w:after="60"/>
+      </w:pPr>
+      <w:r>
+        <w:t xml:space="preserve">It is an author-conducted self-assessment carried out as part of the project, not an independent third-party penetration test; objectivity is therefore inherently bounded, and an external review would strengthen assurance.</w:t>
+      </w:r>
+    </w:p>
+    <w:p>
+      <w:pPr>
+        <w:pStyle w:val="ListParagraph"/>
+        <w:numPr>
+          <w:ilvl w:val="0"/>
+          <w:numId w:val="2"/>
+        </w:numPr>
+        <w:spacing w:after="60"/>
+      </w:pPr>
+      <w:r>
+        <w:t xml:space="preserve">It is a white-box source review. Dynamic black-box testing against a running instance was limited to the project's existing functional verification; no fuzzing of the live HTTP surface beyond the automated suite was performed.</w:t>
+      </w:r>
+    </w:p>
+    <w:p>
+      <w:pPr>
+        <w:pStyle w:val="ListParagraph"/>
+        <w:numPr>
+          <w:ilvl w:val="0"/>
+          <w:numId w:val="2"/>
+        </w:numPr>
+        <w:spacing w:after="60"/>
+      </w:pPr>
+      <w:r>
+        <w:t xml:space="preserve">Scope is the application source at the reviewed revision. It excludes the host operating system, the third-party nmap binary, and external services consumed (NVD, OSV, CISA KEV, FIRST EPSS), which are trusted as out-of-scope dependencies.</w:t>
+      </w:r>
+    </w:p>
+    <w:p>
+      <w:pPr>
+        <w:pStyle w:val="ListParagraph"/>
+        <w:numPr>
+          <w:ilvl w:val="0"/>
+          <w:numId w:val="2"/>
+        </w:numPr>
+        <w:spacing w:after="60"/>
+      </w:pPr>
+      <w:r>
+        <w:t xml:space="preserve">Severities are assigned qualitatively (High / Medium / Low / Informational) by reference to exploitability and impact, not a formal CVSS calculation.</w:t>
+      </w:r>
+    </w:p>
+    <w:p>
+      <w:pPr>
+        <w:pStyle w:val="ListParagraph"/>
+        <w:numPr>
+          <w:ilvl w:val="0"/>
+          <w:numId w:val="2"/>
+        </w:numPr>
+        <w:spacing w:after="60"/>
+      </w:pPr>
+      <w:r>
+        <w:t xml:space="preserve">The assessment is a point-in-time snapshot; subsequent code changes should be re-reviewed.</w:t>
+      </w:r>
+    </w:p>
+    <w:p>
+      <w:pPr>
+        <w:spacing w:after="120" w:before="80"/>
+      </w:pPr>
+      <w:r>
+        <w:rPr>
+          <w:b/>
+          <w:bCs/>
+        </w:rPr>
+        <w:t xml:space="preserve">Author declaration. </w:t>
+      </w:r>
+      <w:r>
+        <w:t xml:space="preserve">This assessment was conducted by the project author for the purpose of the MSc dissertation. All remediations were validated by automated tests and re-scanning. It documents the security posture of the artefact and the engineering response to the findings; it is not a substitute for an independent professional security audit.</w:t>
       </w:r>
     </w:p>
     <w:p>
@@ -1757,7 +2753,7 @@
     </w:p>
     <w:p>
       <w:pPr>
-        <w:spacing w:after="80"/>
+        <w:spacing w:after="40"/>
       </w:pPr>
       <w:r>
         <w:rPr>
@@ -1777,6 +2773,26 @@
     </w:p>
     <w:p>
       <w:pPr>
+        <w:spacing w:after="80"/>
+      </w:pPr>
+      <w:r>
+        <w:rPr>
+          <w:b/>
+          <w:bCs/>
+        </w:rPr>
+        <w:t xml:space="preserve">References.  </w:t>
+      </w:r>
+      <w:r>
+        <w:rPr>
+          <w:color w:val="475569"/>
+          <w:sz w:val="18"/>
+          <w:szCs w:val="18"/>
+        </w:rPr>
+        <w:t xml:space="preserve">CWE-306 (Missing Authentication for a Critical Function); CWE-668 (Exposure of Resource to Wrong Sphere). OWASP A01:2021 Broken Access Control; A05:2021 Security Misconfiguration.</w:t>
+      </w:r>
+    </w:p>
+    <w:p>
+      <w:pPr>
         <w:pStyle w:val="Heading2"/>
         <w:spacing w:after="80" w:before="200"/>
       </w:pPr>
@@ -1824,7 +2840,7 @@
     </w:p>
     <w:p>
       <w:pPr>
-        <w:spacing w:after="80"/>
+        <w:spacing w:after="40"/>
       </w:pPr>
       <w:r>
         <w:rPr>
@@ -1844,6 +2860,26 @@
     </w:p>
     <w:p>
       <w:pPr>
+        <w:spacing w:after="80"/>
+      </w:pPr>
+      <w:r>
+        <w:rPr>
+          <w:b/>
+          <w:bCs/>
+        </w:rPr>
+        <w:t xml:space="preserve">References.  </w:t>
+      </w:r>
+      <w:r>
+        <w:rPr>
+          <w:color w:val="475569"/>
+          <w:sz w:val="18"/>
+          <w:szCs w:val="18"/>
+        </w:rPr>
+        <w:t xml:space="preserve">CWE-350 (Reliance on Reverse DNS); CWE-352 (Cross-Site Request Forgery). OWASP A01:2021. Class: DNS rebinding against a localhost service.</w:t>
+      </w:r>
+    </w:p>
+    <w:p>
+      <w:pPr>
         <w:pStyle w:val="Heading2"/>
         <w:spacing w:after="80" w:before="200"/>
       </w:pPr>
@@ -1891,7 +2927,7 @@
     </w:p>
     <w:p>
       <w:pPr>
-        <w:spacing w:after="80"/>
+        <w:spacing w:after="40"/>
       </w:pPr>
       <w:r>
         <w:rPr>
@@ -1911,6 +2947,26 @@
     </w:p>
     <w:p>
       <w:pPr>
+        <w:spacing w:after="80"/>
+      </w:pPr>
+      <w:r>
+        <w:rPr>
+          <w:b/>
+          <w:bCs/>
+        </w:rPr>
+        <w:t xml:space="preserve">References.  </w:t>
+      </w:r>
+      <w:r>
+        <w:rPr>
+          <w:color w:val="475569"/>
+          <w:sz w:val="18"/>
+          <w:szCs w:val="18"/>
+        </w:rPr>
+        <w:t xml:space="preserve">CWE-285 (Improper Authorization); CWE-200 (Exposure of Sensitive Information). OWASP A01:2021.</w:t>
+      </w:r>
+    </w:p>
+    <w:p>
+      <w:pPr>
         <w:pStyle w:val="Heading2"/>
         <w:spacing w:after="80" w:before="200"/>
       </w:pPr>
@@ -1958,7 +3014,7 @@
     </w:p>
     <w:p>
       <w:pPr>
-        <w:spacing w:after="80"/>
+        <w:spacing w:after="40"/>
       </w:pPr>
       <w:r>
         <w:rPr>
@@ -1978,6 +3034,26 @@
     </w:p>
     <w:p>
       <w:pPr>
+        <w:spacing w:after="80"/>
+      </w:pPr>
+      <w:r>
+        <w:rPr>
+          <w:b/>
+          <w:bCs/>
+        </w:rPr>
+        <w:t xml:space="preserve">References.  </w:t>
+      </w:r>
+      <w:r>
+        <w:rPr>
+          <w:color w:val="475569"/>
+          <w:sz w:val="18"/>
+          <w:szCs w:val="18"/>
+        </w:rPr>
+        <w:t xml:space="preserve">CWE-400 (Uncontrolled Resource Consumption). OWASP A05:2021.</w:t>
+      </w:r>
+    </w:p>
+    <w:p>
+      <w:pPr>
         <w:pStyle w:val="Heading2"/>
         <w:spacing w:after="80" w:before="200"/>
       </w:pPr>
@@ -2025,7 +3101,7 @@
     </w:p>
     <w:p>
       <w:pPr>
-        <w:spacing w:after="80"/>
+        <w:spacing w:after="40"/>
       </w:pPr>
       <w:r>
         <w:rPr>
@@ -2045,6 +3121,26 @@
     </w:p>
     <w:p>
       <w:pPr>
+        <w:spacing w:after="80"/>
+      </w:pPr>
+      <w:r>
+        <w:rPr>
+          <w:b/>
+          <w:bCs/>
+        </w:rPr>
+        <w:t xml:space="preserve">References.  </w:t>
+      </w:r>
+      <w:r>
+        <w:rPr>
+          <w:color w:val="475569"/>
+          <w:sz w:val="18"/>
+          <w:szCs w:val="18"/>
+        </w:rPr>
+        <w:t xml:space="preserve">CWE-598 (Information Exposure Through Query Strings in GET). OWASP A09:2021 Security Logging and Monitoring Failures.</w:t>
+      </w:r>
+    </w:p>
+    <w:p>
+      <w:pPr>
         <w:pStyle w:val="Heading2"/>
         <w:spacing w:after="80" w:before="200"/>
       </w:pPr>
@@ -2092,7 +3188,7 @@
     </w:p>
     <w:p>
       <w:pPr>
-        <w:spacing w:after="80"/>
+        <w:spacing w:after="40"/>
       </w:pPr>
       <w:r>
         <w:rPr>
@@ -2112,6 +3208,26 @@
     </w:p>
     <w:p>
       <w:pPr>
+        <w:spacing w:after="80"/>
+      </w:pPr>
+      <w:r>
+        <w:rPr>
+          <w:b/>
+          <w:bCs/>
+        </w:rPr>
+        <w:t xml:space="preserve">References.  </w:t>
+      </w:r>
+      <w:r>
+        <w:rPr>
+          <w:color w:val="475569"/>
+          <w:sz w:val="18"/>
+          <w:szCs w:val="18"/>
+        </w:rPr>
+        <w:t xml:space="preserve">CWE-73 (External Control of File Name or Path). Mitigated by admin authorisation; accepted.</w:t>
+      </w:r>
+    </w:p>
+    <w:p>
+      <w:pPr>
         <w:pStyle w:val="Heading2"/>
         <w:spacing w:after="80" w:before="200"/>
       </w:pPr>
@@ -2159,7 +3275,7 @@
     </w:p>
     <w:p>
       <w:pPr>
-        <w:spacing w:after="80"/>
+        <w:spacing w:after="40"/>
       </w:pPr>
       <w:r>
         <w:rPr>
@@ -2175,6 +3291,26 @@
           <w:szCs w:val="18"/>
         </w:rPr>
         <w:t xml:space="preserve">docs/THREAT_MODEL.md, SECURITY.md</w:t>
+      </w:r>
+    </w:p>
+    <w:p>
+      <w:pPr>
+        <w:spacing w:after="80"/>
+      </w:pPr>
+      <w:r>
+        <w:rPr>
+          <w:b/>
+          <w:bCs/>
+        </w:rPr>
+        <w:t xml:space="preserve">References.  </w:t>
+      </w:r>
+      <w:r>
+        <w:rPr>
+          <w:color w:val="475569"/>
+          <w:sz w:val="18"/>
+          <w:szCs w:val="18"/>
+        </w:rPr>
+        <w:t xml:space="preserve">CWE-732 (Incorrect Permission Assignment for a Critical Resource).</w:t>
       </w:r>
     </w:p>
     <w:p>

</xml_diff>